<commit_message>
Witness preprint DOI (zenodo.23036963) in all citing papers; PDFs and Word regenerated
</commit_message>
<xml_diff>
--- a/manuscript/preprint_qang_revisado.docx
+++ b/manuscript/preprint_qang_revisado.docx
@@ -17789,7 +17789,7 @@
       </w:r>
     </w:p>
     <w:bookmarkEnd w:id="38"/>
-    <w:bookmarkStart w:id="82" w:name="app:riesz"/>
+    <w:bookmarkStart w:id="83" w:name="app:riesz"/>
     <w:p>
       <w:pPr>
         <w:pStyle w:val="Heading1"/>
@@ -18329,7 +18329,7 @@
         <w:t xml:space="preserve">infinite-dimensional spaces and plays no role here.)</w:t>
       </w:r>
     </w:p>
-    <w:bookmarkStart w:id="81" w:name="refs"/>
+    <w:bookmarkStart w:id="82" w:name="refs"/>
     <w:bookmarkStart w:id="40" w:name="ref-monteverde2026qang"/>
     <w:p>
       <w:pPr>
@@ -19199,7 +19199,7 @@
       </w:r>
     </w:p>
     <w:bookmarkEnd w:id="67"/>
-    <w:bookmarkStart w:id="68" w:name="ref-monteverde2026witness"/>
+    <w:bookmarkStart w:id="69" w:name="ref-monteverde2026witness"/>
     <w:p>
       <w:pPr>
         <w:pStyle w:val="Bibliography"/>
@@ -19220,17 +19220,38 @@
         <w:t xml:space="preserve"> </w:t>
       </w:r>
       <w:r>
-        <w:t xml:space="preserve">“The register-mean polar bias as a symmetry witness: Error mitigation, constrained optimization and qubit characterization in qg units.”</w:t>
-      </w:r>
-      <w:r>
-        <w:t xml:space="preserve"> </w:t>
-      </w:r>
-      <w:r>
-        <w:t xml:space="preserve">2026.</w:t>
+        <w:t xml:space="preserve">“The register-mean polar bias as a symmetry witness: Error mitigation, constrained optimization and qubit characterization in qg units,”</w:t>
+      </w:r>
+      <w:r>
+        <w:t xml:space="preserve"> </w:t>
+      </w:r>
+      <w:r>
+        <w:rPr>
+          <w:iCs/>
+          <w:i/>
+        </w:rPr>
+        <w:t xml:space="preserve">Zenodo preprint</w:t>
+      </w:r>
+      <w:r>
+        <w:t xml:space="preserve">, 2026, doi:</w:t>
+      </w:r>
+      <w:r>
+        <w:t xml:space="preserve"> </w:t>
+      </w:r>
+      <w:hyperlink r:id="rId68">
+        <w:r>
+          <w:rPr>
+            <w:rStyle w:val="Hyperlink"/>
+          </w:rPr>
+          <w:t xml:space="preserve">10.5281/zenodo.23036963</w:t>
+        </w:r>
+      </w:hyperlink>
+      <w:r>
+        <w:t xml:space="preserve">.</w:t>
       </w:r>
     </w:p>
-    <w:bookmarkEnd w:id="68"/>
-    <w:bookmarkStart w:id="69" w:name="ref-monteverde2026leakage"/>
+    <w:bookmarkEnd w:id="69"/>
+    <w:bookmarkStart w:id="70" w:name="ref-monteverde2026leakage"/>
     <w:p>
       <w:pPr>
         <w:pStyle w:val="Bibliography"/>
@@ -19269,8 +19290,8 @@
         <w:t xml:space="preserve">2026.</w:t>
       </w:r>
     </w:p>
-    <w:bookmarkEnd w:id="69"/>
-    <w:bookmarkStart w:id="70" w:name="ref-schuld2021"/>
+    <w:bookmarkEnd w:id="70"/>
+    <w:bookmarkStart w:id="71" w:name="ref-schuld2021"/>
     <w:p>
       <w:pPr>
         <w:pStyle w:val="Bibliography"/>
@@ -19307,8 +19328,8 @@
         <w:t xml:space="preserve">, vol. 103, p. 032430, 2021.</w:t>
       </w:r>
     </w:p>
-    <w:bookmarkEnd w:id="70"/>
-    <w:bookmarkStart w:id="71" w:name="ref-kyriienko2021"/>
+    <w:bookmarkEnd w:id="71"/>
+    <w:bookmarkStart w:id="72" w:name="ref-kyriienko2021"/>
     <w:p>
       <w:pPr>
         <w:pStyle w:val="Bibliography"/>
@@ -19345,8 +19366,8 @@
         <w:t xml:space="preserve">, vol. 103, p. 052416, 2021.</w:t>
       </w:r>
     </w:p>
-    <w:bookmarkEnd w:id="71"/>
-    <w:bookmarkStart w:id="72" w:name="ref-cerezo2023simulability"/>
+    <w:bookmarkEnd w:id="72"/>
+    <w:bookmarkStart w:id="73" w:name="ref-cerezo2023simulability"/>
     <w:p>
       <w:pPr>
         <w:pStyle w:val="Bibliography"/>
@@ -19398,8 +19419,8 @@
         <w:t xml:space="preserve">2023.</w:t>
       </w:r>
     </w:p>
-    <w:bookmarkEnd w:id="72"/>
-    <w:bookmarkStart w:id="73" w:name="ref-correa2015"/>
+    <w:bookmarkEnd w:id="73"/>
+    <w:bookmarkStart w:id="74" w:name="ref-correa2015"/>
     <w:p>
       <w:pPr>
         <w:pStyle w:val="Bibliography"/>
@@ -19436,8 +19457,8 @@
         <w:t xml:space="preserve">, vol. 114, p. 220405, 2015.</w:t>
       </w:r>
     </w:p>
-    <w:bookmarkEnd w:id="73"/>
-    <w:bookmarkStart w:id="75" w:name="ref-singh2026qml"/>
+    <w:bookmarkEnd w:id="74"/>
+    <w:bookmarkStart w:id="76" w:name="ref-singh2026qml"/>
     <w:p>
       <w:pPr>
         <w:pStyle w:val="Bibliography"/>
@@ -19476,7 +19497,7 @@
       <w:r>
         <w:t xml:space="preserve"> </w:t>
       </w:r>
-      <w:hyperlink r:id="rId74">
+      <w:hyperlink r:id="rId75">
         <w:r>
           <w:rPr>
             <w:rStyle w:val="Hyperlink"/>
@@ -19488,8 +19509,8 @@
         <w:t xml:space="preserve">.</w:t>
       </w:r>
     </w:p>
-    <w:bookmarkEnd w:id="75"/>
-    <w:bookmarkStart w:id="77" w:name="ref-huang2020"/>
+    <w:bookmarkEnd w:id="76"/>
+    <w:bookmarkStart w:id="78" w:name="ref-huang2020"/>
     <w:p>
       <w:pPr>
         <w:pStyle w:val="Bibliography"/>
@@ -19528,7 +19549,7 @@
       <w:r>
         <w:t xml:space="preserve"> </w:t>
       </w:r>
-      <w:hyperlink r:id="rId76">
+      <w:hyperlink r:id="rId77">
         <w:r>
           <w:rPr>
             <w:rStyle w:val="Hyperlink"/>
@@ -19540,8 +19561,8 @@
         <w:t xml:space="preserve">.</w:t>
       </w:r>
     </w:p>
-    <w:bookmarkEnd w:id="77"/>
-    <w:bookmarkStart w:id="78" w:name="ref-bonetmonroig2018"/>
+    <w:bookmarkEnd w:id="78"/>
+    <w:bookmarkStart w:id="79" w:name="ref-bonetmonroig2018"/>
     <w:p>
       <w:pPr>
         <w:pStyle w:val="Bibliography"/>
@@ -19578,8 +19599,8 @@
         <w:t xml:space="preserve">, vol. 98, p. 062339, 2018.</w:t>
       </w:r>
     </w:p>
-    <w:bookmarkEnd w:id="78"/>
-    <w:bookmarkStart w:id="79" w:name="ref-riesz1907"/>
+    <w:bookmarkEnd w:id="79"/>
+    <w:bookmarkStart w:id="80" w:name="ref-riesz1907"/>
     <w:p>
       <w:pPr>
         <w:pStyle w:val="Bibliography"/>
@@ -19654,8 +19675,8 @@
         <w:t xml:space="preserve">, vol. 144, pp. 1409–1411, 1907.</w:t>
       </w:r>
     </w:p>
-    <w:bookmarkEnd w:id="79"/>
-    <w:bookmarkStart w:id="80" w:name="ref-frechet1907"/>
+    <w:bookmarkEnd w:id="80"/>
+    <w:bookmarkStart w:id="81" w:name="ref-frechet1907"/>
     <w:p>
       <w:pPr>
         <w:pStyle w:val="Bibliography"/>
@@ -19718,9 +19739,9 @@
         <w:t xml:space="preserve">, vol. 144, pp. 1414–1416, 1907.</w:t>
       </w:r>
     </w:p>
-    <w:bookmarkEnd w:id="80"/>
     <w:bookmarkEnd w:id="81"/>
     <w:bookmarkEnd w:id="82"/>
+    <w:bookmarkEnd w:id="83"/>
     <w:sectPr>
       <w:footerReference w:type="default" r:id="rId9"/>
       <w:pgSz w:w="11906" w:h="16838"/>

</xml_diff>

<commit_message>
Manuscripts: remove the AI-tools section from the 13 notes (EN/ES); PDFs and Word files regenerated
</commit_message>
<xml_diff>
--- a/manuscript/preprint_qang_revisado.docx
+++ b/manuscript/preprint_qang_revisado.docx
@@ -17754,40 +17754,6 @@
     </w:p>
     <w:bookmarkEnd w:id="37"/>
     <w:bookmarkStart w:id="38" w:name="acknowledgments-and-use-of-ai-tools"/>
-    <w:p>
-      <w:pPr>
-        <w:pStyle w:val="Heading1"/>
-      </w:pPr>
-      <w:r>
-        <w:t xml:space="preserve">Acknowledgments and use of AI tools</w:t>
-      </w:r>
-    </w:p>
-    <w:p>
-      <w:pPr>
-        <w:pStyle w:val="FirstParagraph"/>
-      </w:pPr>
-      <w:r>
-        <w:t xml:space="preserve">Generative AI tools (Anthropic Claude 3.5 Sonnet and Claude Opus 5.5; OpenAI GPT-4o) assisted with</w:t>
-      </w:r>
-      <w:r>
-        <w:t xml:space="preserve"> </w:t>
-      </w:r>
-      <w:r>
-        <w:t xml:space="preserve">code generation and refactoring, test expansion, numerical experiments, and drafting of this text.</w:t>
-      </w:r>
-      <w:r>
-        <w:t xml:space="preserve"> </w:t>
-      </w:r>
-      <w:r>
-        <w:t xml:space="preserve">The author framed the research questions, made the design decisions, and reviewed, edited and</w:t>
-      </w:r>
-      <w:r>
-        <w:t xml:space="preserve"> </w:t>
-      </w:r>
-      <w:r>
-        <w:t xml:space="preserve">validated all AI-assisted output, including every derivation and number reported here.</w:t>
-      </w:r>
-    </w:p>
     <w:bookmarkEnd w:id="38"/>
     <w:bookmarkStart w:id="83" w:name="app:riesz"/>
     <w:p>

</xml_diff>